<commit_message>
Edicion de estilo: rompe enumeraciones mecanicas, divide oraciones sobrecargadas
</commit_message>
<xml_diff>
--- a/Ensayo_organizacion_empresarial_agro_final.docx
+++ b/Ensayo_organizacion_empresarial_agro_final.docx
@@ -230,7 +230,7 @@
           <w:sz w:val="24"/>
           <w:lang w:val="es-ES"/>
         </w:rPr>
-        <w:t>La presentación dice que en la anónima la vida de la sociedad es más importante que el bienestar de los socios. Para sostener una planta procesadora treinta años eso es una ventaja. Para un productor que entra con pocas acciones es más bien un aviso. Con la responsabilidad limitada pasa algo parecido: la unidad la presenta como el eje de las sociedades mercantiles, y protege al socio, pero porque parte del riesgo lo absorben los acreedores y los proveedores que le venden a la sociedad. No está mal, es como funciona. Por eso las asambleas, ordinarias y extraordinarias, no son un trámite: son donde el socio chico puede pesar algo.</w:t>
+        <w:t>La presentación dice que en la anónima la vida de la sociedad es más importante que el bienestar de los socios. Para sostener una planta procesadora treinta años eso es una ventaja. Para un productor que entra con pocas acciones es más bien un aviso. Con la responsabilidad limitada pasa algo parecido. La unidad la presenta como el eje de las sociedades mercantiles, y sí protege al socio. Pero lo hace trasladando parte del riesgo a los acreedores y a los proveedores que le venden a la sociedad. No está mal, es como funciona. Por eso las asambleas, ordinarias y extraordinarias, no son un trámite: son donde el socio chico puede pesar algo.</w:t>
       </w:r>
     </w:p>
     <w:p>
@@ -291,7 +291,22 @@
           <w:sz w:val="24"/>
           <w:lang w:val="es-ES"/>
         </w:rPr>
-        <w:t>Su idea principal es que las empresas que innovan seguido y ganando plata lo logran porque volvieron la innovación una rutina de la casa, con el mismo esfuerzo con que otras metieron la calidad total, y que eso se tiene que liderar desde arriba (Gibson et al., 2011). Natura es el ejemplo más armado: vicepresidencia de innovación, comités en cada unidad de negocio, equipos multifuncionales. BAC Credomatic maneja las ideas con ferias internas y premia que se implementen, no que se propongan. Los dos textos le dan peso a la innovación abierta, que es aceptar ideas de afuera y no solo del área técnica propia. Brenes et al. (2014) la miden por la relación con universidades, y ahí las diferenciadas van bastante más lejos que el resto.</w:t>
+        <w:t>Su idea principal es que las empresas que innovan seguido y ganando plata lo logran porque volvieron la innovación una rutina de la casa, con el mismo esfuerzo con que otras metieron la calidad total. Para ellos eso no camina si no se lidera desde arriba (Gibson et al., 2011).</w:t>
+      </w:r>
+    </w:p>
+    <w:p>
+      <w:pPr>
+        <w:spacing w:line="480" w:lineRule="auto" w:before="0" w:after="0"/>
+        <w:ind w:firstLine="720"/>
+        <w:jc w:val="both"/>
+      </w:pPr>
+      <w:r>
+        <w:rPr>
+          <w:rFonts w:ascii="Times New Roman" w:hAnsi="Times New Roman" w:eastAsia="Times New Roman" w:cs="Times New Roman"/>
+          <w:sz w:val="24"/>
+          <w:lang w:val="es-ES"/>
+        </w:rPr>
+        <w:t>Natura es el caso más armado: montó una vicepresidencia de innovación, puso comités en cada unidad de negocio y armó equipos que cruzan áreas. BAC Credomatic va por otro lado y maneja las ideas con ferias internas, donde premia que se implementen y no que se propongan. Los dos textos le dan peso a la innovación abierta, que es aceptar ideas de afuera y no solo del área técnica propia. Brenes et al. (2014) la miden por la relación con universidades, y ahí las diferenciadas van bastante más lejos que el resto.</w:t>
       </w:r>
     </w:p>
     <w:p>
@@ -367,7 +382,7 @@
           <w:sz w:val="24"/>
           <w:lang w:val="es-ES"/>
         </w:rPr>
-        <w:t>De las que se diferencian, el 82% usa marcas propias en grado alto o extremo, el 91% conoce el perfil de su cliente final, el 76% usa el origen para vender y el 58% tiene más certificaciones internacionales que sus competidores, contra 33% del otro grupo (Brenes et al., 2014). Dos productoras de mango muestran el mecanismo: una eligió las variedades pensando en el mercado al que iba a vender, y la otra las eligió solo por condiciones agronómicas y se dio cuenta tarde de que su fruta no gustaba allá. Una decisión de siembra sin decisión comercial atrás se paga años después, cuando ya no hay arreglo.</w:t>
+        <w:t>Lo que hacen distinto se ve en los números. El 82% de las diferenciadas vende con marca propia, y eso pesa porque la marca es lo que deja el valor dentro de la empresa en vez de regalárselo al intermediario. El 91% conoce el perfil de su cliente final, contra 72% de las otras. Tres de cada cuatro usan el origen para vender. Y en certificaciones internacionales la brecha es la más ancha: 58% contra 33% (Brenes et al., 2014). Dos productoras de mango muestran el mecanismo: una eligió las variedades pensando en el mercado al que iba a vender, y la otra las eligió solo por condiciones agronómicas y se dio cuenta tarde de que su fruta no gustaba allá. Una decisión de siembra sin decisión comercial atrás se paga años después, cuando ya no hay arreglo.</w:t>
       </w:r>
     </w:p>
     <w:p>
@@ -458,7 +473,7 @@
           <w:sz w:val="24"/>
           <w:lang w:val="es-ES"/>
         </w:rPr>
-        <w:t>Organizarse como empresa es lo que permite que la agricultura se quede con el valor que produce. Las figuras del comerciante individual y de las sociedades definen quién responde, quién decide y cómo se pasa la propiedad; la empresa mercantil guarda la marca y las patentes, que es donde hoy está buena parte del precio; la innovación vuelta rutina hace que las mejoras se repitan en vez de salir por suerte; y la diferenciación es lo que hace que el comprador pague por esas mejoras.</w:t>
+        <w:t>Organizarse como empresa es lo que permite que la agricultura se quede con el valor que produce. Las figuras del comerciante y de las sociedades definen quién responde y quién decide. La empresa mercantil es la que guarda la marca y las patentes, donde hoy está buena parte del precio. Cuando la innovación se vuelve rutina, las mejoras se repiten en vez de salir por suerte. Y la diferenciación es lo que hace que el comprador pague por ellas.</w:t>
       </w:r>
     </w:p>
     <w:p>

</xml_diff>

<commit_message>
Reemplaza enunciados vagos por afirmaciones concretas
</commit_message>
<xml_diff>
--- a/Ensayo_organizacion_empresarial_agro_final.docx
+++ b/Ensayo_organizacion_empresarial_agro_final.docx
@@ -139,7 +139,7 @@
           <w:sz w:val="24"/>
           <w:lang w:val="es-ES"/>
         </w:rPr>
-        <w:t>Un productor puede sacar un producto muy bueno y venderlo igual de barato, a granel, sin marca y sin saber quién se lo come al final. Eso no se arregla sembrando mejor. Se arregla con organización, y es lo que discuten las tres lecturas de la unidad desde ángulos distintos.</w:t>
+        <w:t>Un productor puede sacar un producto muy bueno y venderlo igual de barato, a granel, sin marca y sin saber quién se lo come al final. Eso no se arregla sembrando mejor. Se arregla con organización: alguien que responda legalmente, que pueda registrar una marca y que tenga con qué sentarse a negociar.</w:t>
       </w:r>
     </w:p>
     <w:p>
@@ -154,7 +154,7 @@
           <w:sz w:val="24"/>
           <w:lang w:val="es-ES"/>
         </w:rPr>
-        <w:t>Organizarse como empresa es lo que permite que el trabajo del campo se convierta en plata que se queda con el productor, y no en materia prima que otro termina de valorizar. La presentación de la unidad da las figuras legales, Gibson y sus colegas muestran empresas que volvieron la innovación algo permanente, y Brenes con su equipo compara agroempresas que cobran más caro contra las que no. También hay que decir que organizarse cuesta y que no toda estructura le sirve a todo el mundo.</w:t>
+        <w:t>Organizarse como empresa es lo que permite que el trabajo del campo se convierta en plata que se queda con el productor, y no en materia prima que otro termina de valorizar. La presentación de la unidad da las figuras legales, Gibson y sus colegas muestran empresas que volvieron la innovación algo permanente, y Brenes con su equipo compara agroempresas que cobran más caro contra las que no. También hay que decir que organizarse cuesta: hay registros que pagar, libros que llevar y asambleas que atrasan decisiones urgentes.</w:t>
       </w:r>
     </w:p>
     <w:p>
@@ -215,7 +215,7 @@
           <w:sz w:val="24"/>
           <w:lang w:val="es-ES"/>
         </w:rPr>
-        <w:t>Las sociedades mercantiles resuelven eso de distintas formas. La de responsabilidad limitada sigue siendo personalista, tiene un tope de socios, la propiedad se divide en partes sociales con reglas para transmitirlas y para la salida del socio, y la administración es menos burocrática, normalmente con un gerente general (Soto Díaz, 2025). Para cinco o seis productores que se conocen, me parece la opción más lógica. La anónima está pensada para negocios que necesitan mucho capital: la propiedad son acciones, iguales e indivisibles, que circulan como títulos valores y dan derecho a dividendos y a voto, y la representación legal queda en un consejo de administración o en un administrador único (Soto Díaz, 2025).</w:t>
+        <w:t>Las sociedades mercantiles cortan ese nudo separando el patrimonio de la empresa del patrimonio del socio. La de responsabilidad limitada sigue siendo personalista, tiene un tope de socios, la propiedad se divide en partes sociales con reglas para transmitirlas y para la salida del socio, y la administración es menos burocrática, normalmente con un gerente general (Soto Díaz, 2025). Para cinco o seis productores que se conocen, me parece la opción más lógica. La anónima está pensada para negocios que necesitan mucho capital: la propiedad son acciones, iguales e indivisibles, que circulan como títulos valores y dan derecho a dividendos y a voto, y la representación legal queda en un consejo de administración o en un administrador único (Soto Díaz, 2025).</w:t>
       </w:r>
     </w:p>
     <w:p>
@@ -321,7 +321,7 @@
           <w:sz w:val="24"/>
           <w:lang w:val="es-ES"/>
         </w:rPr>
-        <w:t>El artículo tiene un límite claro. Escogieron empresas a las que ya les fue bien y después buscaron qué tenían en común, así que no aparece ninguna que hiciera lo mismo y fracasara. Tampoco discuten el orden de los factores: Natura pudo pagar una vicepresidencia entera porque ya era líder en Brasil, y capaz la estructura no la hizo rentable sino que ser rentable le permitió pagar la estructura. Queda algo más chico y más aplicable: para innovar seguido hace falta alguien a cargo, alguna forma de filtrar ideas y seguimiento de lo que se aprobó. En una empresa chica eso puede ser una persona y una reunión al mes.</w:t>
+        <w:t>El artículo tiene un problema de método. Escogieron empresas a las que ya les fue bien y después buscaron qué tenían en común, así que no aparece ninguna que hiciera lo mismo y fracasara. Tampoco discuten el orden de los factores: Natura pudo pagar una vicepresidencia entera porque ya era líder en Brasil, y capaz la estructura no la hizo rentable sino que ser rentable le permitió pagar la estructura. Queda algo más chico y más aplicable: para innovar seguido hace falta alguien a cargo, alguna forma de filtrar ideas y seguimiento de lo que se aprobó. En una empresa chica eso puede ser una persona y una reunión al mes.</w:t>
       </w:r>
     </w:p>
     <w:p>
@@ -336,7 +336,7 @@
           <w:sz w:val="24"/>
           <w:lang w:val="es-ES"/>
         </w:rPr>
-        <w:t>En Coopedota hay un dato que el artículo menciona de pasada. Lograron el primer café que neutraliza del todo sus emisiones de carbono trabajando en red con proveedores, universidades y consultores, y los productores aceptaron recibir menos dividendos para financiar la experimentación (Gibson et al., 2011). Innovar se pagó con el ingreso de los socios, apostando a algo que podía no funcionar. Una decisión así no puede salir solo de la gerencia: tiene que pasar por una asamblea y por socios que entiendan qué están arriesgando. Ahí las dos lecturas se juntan, porque la figura legal es lo que hace legítima la apuesta técnica.</w:t>
+        <w:t>En Coopedota hay un dato que el artículo menciona de pasada. Lograron el primer café que neutraliza del todo sus emisiones de carbono trabajando en red con proveedores, universidades y consultores, y los productores aceptaron recibir menos dividendos para financiar la experimentación (Gibson et al., 2011). Innovar se pagó con el ingreso de los socios, apostando a algo que podía no funcionar. Una decisión así no puede salir solo de la gerencia: tiene que pasar por una asamblea y por socios que entiendan qué están arriesgando. Sin esa asamblea, el café carbono neutral de Coopedota habría sido una apuesta de la gerencia financiada con plata de los caficultores.</w:t>
       </w:r>
     </w:p>
     <w:p>
@@ -397,7 +397,7 @@
           <w:sz w:val="24"/>
           <w:lang w:val="es-ES"/>
         </w:rPr>
-        <w:t>Las certificaciones y la distribución hacen algo parecido. La certificación vuelve comprobable algo que el comprador no puede verificar solo, y controlar el canal hace que el producto llegue como se prometió. Britt se hizo cargo de su distribución cuando vio que el distribuidor contratado no entendía qué tenían de distinto sus productos, y Monteverde compró una distribuidora de refrigerados (Brenes et al., 2014). En promedio las diferenciadas están más integradas hacia adelante: 67% contra 39%. Pero de ahí no saco que todos deban integrarse. Los Grobo, que Gibson et al. (2011) elogian por ser liviana en activos, vende granos básicos, donde diferenciarse por atributos es difícil y lo que rinde es coordinar y bajar costos. Integrarse sirve cuando el valor se puede perder en el canal, no como regla general.</w:t>
+        <w:t>Las certificaciones y el control del canal atacan el mismo problema: el comprador no puede ver por dentro lo que compra. La certificación vuelve comprobable algo que el comprador no puede verificar solo, y controlar el canal hace que el producto llegue como se prometió. Britt se hizo cargo de su distribución cuando vio que el distribuidor contratado no entendía qué tenían de distinto sus productos, y Monteverde compró una distribuidora de refrigerados (Brenes et al., 2014). En promedio las diferenciadas están más integradas hacia adelante: 67% contra 39%. Pero de ahí no saco que todos deban integrarse. Los Grobo, que Gibson et al. (2011) elogian por ser liviana en activos, vende granos básicos, donde diferenciarse por atributos es difícil y lo que rinde es coordinar y bajar costos. Integrarse sirve cuando el valor se puede perder en el canal, no como regla general.</w:t>
       </w:r>
     </w:p>
     <w:p>
@@ -427,7 +427,7 @@
           <w:sz w:val="24"/>
           <w:lang w:val="es-ES"/>
         </w:rPr>
-        <w:t>Ninguna de las lecturas discute un punto que para la región importa. Si el origen es una de las herramientas fuertes de diferenciación, ese origen no lo fabrica una empresa sola: depende de la fama del país, de la credibilidad sanitaria, de denominaciones que son de todos. En un agro donde la mayoría son productores chicos, eso empuja menos a copiar el organigrama de Natura y más a asociarse para cuidar algo compartido, que es volver a las formas societarias con que empezó la unidad.</w:t>
+        <w:t>De todas las herramientas de diferenciación que enumeran, el origen es la única que una empresa no fabrica sola, y ninguna de las lecturas lo discute. Depende de la fama del país, de la credibilidad sanitaria, de denominaciones que son de todos. En un agro donde la mayoría son productores chicos, eso empuja menos a copiar el organigrama de Natura y más a asociarse para cuidar algo compartido, que es volver a las formas societarias con que empezó la unidad.</w:t>
       </w:r>
     </w:p>
     <w:p>
@@ -488,7 +488,7 @@
           <w:sz w:val="24"/>
           <w:lang w:val="es-ES"/>
         </w:rPr>
-        <w:t>Ninguna de las cuatro cosas funciona sola. Una marca sin producto detrás se cae, una innovación que nadie aprueba ni financia no se hace, y una buena cosecha sin canal ni contrato se termina vendiendo al primer intermediario en las condiciones que él ponga. Tampoco creo que la respuesta sea formalizar todo al máximo: la estructura cuesta plata y una asamblea es lenta cuando hay que decidir en plena cosecha. Cada productor necesita la organización que corresponde al valor que quiere capturar. Quien vende commodity puede sobrevivir con poco. Quien quiere cobrar más que el vecino necesita marca, certificaciones, reglas de decisión y alguien que responda, y todo eso pide una figura jurídica que lo sostenga. Ideas en la región hay, los casos lo demuestran; falta armar las organizaciones que las vuelvan permanentes.</w:t>
+        <w:t>Ninguna de las cuatro cosas funciona sola. Una marca sin producto detrás se cae, una innovación que nadie aprueba ni financia no se hace, y una buena cosecha sin canal ni contrato se termina vendiendo al primer intermediario en las condiciones que él ponga. Tampoco creo que la respuesta sea formalizar todo al máximo: la estructura cuesta plata y una asamblea es lenta cuando hay que decidir en plena cosecha. Cada productor necesita la organización que corresponde al valor que quiere capturar. Quien vende commodity puede sobrevivir con poco. Quien quiere cobrar más que el vecino necesita marca, certificaciones, reglas de decisión y alguien que responda, y todo eso pide una figura jurídica que lo sostenga. Coopedota, Britt y Los Grobo muestran que las ideas están. Lo que falta son las estructuras que las sostengan cuando el fundador se cansa o el precio se cae.</w:t>
       </w:r>
     </w:p>
     <w:p>

</xml_diff>

<commit_message>
Elimina muletilla la unidad, rompe trios paralelos y corrige redundancias
</commit_message>
<xml_diff>
--- a/Ensayo_organizacion_empresarial_agro_final.docx
+++ b/Ensayo_organizacion_empresarial_agro_final.docx
@@ -139,7 +139,7 @@
           <w:sz w:val="24"/>
           <w:lang w:val="es-ES"/>
         </w:rPr>
-        <w:t>Un productor puede sacar un producto muy bueno y venderlo igual de barato, a granel, sin marca y sin saber quién se lo come al final. Eso no se arregla sembrando mejor. Se arregla con organización: alguien que responda legalmente, que pueda registrar una marca y que tenga con qué sentarse a negociar.</w:t>
+        <w:t>Un productor puede sacar un producto muy bueno y venderlo igual de barato, a granel, sin marca y sin saber quién se lo come al final. Eso no se arregla sembrando mejor. Se arregla con organización. Tiene que haber alguien que responda legalmente por el negocio, porque ese alguien es el que después puede registrar una marca o firmar un contrato que valga.</w:t>
       </w:r>
     </w:p>
     <w:p>
@@ -154,7 +154,7 @@
           <w:sz w:val="24"/>
           <w:lang w:val="es-ES"/>
         </w:rPr>
-        <w:t>Organizarse como empresa es lo que permite que el trabajo del campo se convierta en plata que se queda con el productor, y no en materia prima que otro termina de valorizar. La presentación de la unidad da las figuras legales, Gibson y sus colegas muestran empresas que volvieron la innovación algo permanente, y Brenes con su equipo compara agroempresas que cobran más caro contra las que no. También hay que decir que organizarse cuesta: hay registros que pagar, libros que llevar y asambleas que atrasan decisiones urgentes.</w:t>
+        <w:t>Organizarse como empresa es lo que permite que el trabajo del campo se convierta en plata que se queda con el productor, y no en materia prima que otro termina de valorizar. Las tres lecturas ayudan a ver por qué. Soto Díaz (2025) repasa las figuras legales. Gibson y sus colegas muestran empresas que volvieron la innovación algo permanente. Brenes con su equipo pone datos sobre qué hacen distinto las agroempresas que cobran más caro. También hay que decir que organizarse cuesta. Hay que pagar registros y llevar libros, y las asambleas atrasan decisiones que muchas veces son urgentes.</w:t>
       </w:r>
     </w:p>
     <w:p>
@@ -185,7 +185,7 @@
           <w:sz w:val="24"/>
           <w:lang w:val="es-ES"/>
         </w:rPr>
-        <w:t>La unidad arranca con la noción de mercantilidad: hay actos mercantiles formales, y los hacen comerciantes, que pueden ser individuales o sociales (Soto Díaz, 2025). Comprar insumos, contratar peones, procesar fruta, registrar una marca o firmar un contrato de suministro son actos de comercio. Para firmarlos tiene que haber alguien que exista jurídicamente, con patrimonio identificable y una manera clara de decidir.</w:t>
+        <w:t>Todo empieza con la noción de mercantilidad: hay actos mercantiles formales, y los hacen comerciantes, que pueden ser individuales o sociales (Soto Díaz, 2025). Comprar insumos, contratar peones, procesar fruta, registrar una marca o firmar un contrato de suministro son actos de comercio. Para firmarlos tiene que haber alguien que exista jurídicamente y que tenga un patrimonio identificable. Sin eso no hay con quién contratar.</w:t>
       </w:r>
     </w:p>
     <w:p>
@@ -230,7 +230,7 @@
           <w:sz w:val="24"/>
           <w:lang w:val="es-ES"/>
         </w:rPr>
-        <w:t>La presentación dice que en la anónima la vida de la sociedad es más importante que el bienestar de los socios. Para sostener una planta procesadora treinta años eso es una ventaja. Para un productor que entra con pocas acciones es más bien un aviso. Con la responsabilidad limitada pasa algo parecido. La unidad la presenta como el eje de las sociedades mercantiles, y sí protege al socio. Pero lo hace trasladando parte del riesgo a los acreedores y a los proveedores que le venden a la sociedad. No está mal, es como funciona. Por eso las asambleas, ordinarias y extraordinarias, no son un trámite: son donde el socio chico puede pesar algo.</w:t>
+        <w:t>La presentación dice que en la anónima la vida de la sociedad es más importante que el bienestar de los socios. Para sostener una planta procesadora treinta años eso es una ventaja. Para un productor que entra con pocas acciones es más bien un aviso. Con la responsabilidad limitada pasa algo parecido. Se la presenta como el eje de las sociedades mercantiles, y sí protege al socio. Pero lo hace trasladando parte del riesgo a los acreedores y a los proveedores que le venden a la sociedad. No está mal, es como funciona. Por eso las asambleas, ordinarias y extraordinarias, no son un trámite: son donde el socio chico puede pesar algo.</w:t>
       </w:r>
     </w:p>
     <w:p>
@@ -245,7 +245,7 @@
           <w:sz w:val="24"/>
           <w:lang w:val="es-ES"/>
         </w:rPr>
-        <w:t>La unidad define la empresa mercantil como un bien mueble, formado por el establecimiento, el nombre comercial, las muestras y signos distintivos, las marcas y las patentes (Soto Díaz, 2025). Una finca vale por la tierra y la maquinaria. Una empresa agrícola armada vale además por un nombre que el comprador reconoce y por cosas que sabe hacer y otros no. Eso solo se puede registrar y defender si hay una figura jurídica atrás.</w:t>
+        <w:t>La empresa mercantil es, en términos legales, un bien mueble, y está formada por el establecimiento, el nombre comercial, las muestras y signos distintivos, las marcas y las patentes (Soto Díaz, 2025). Una finca vale por la tierra y la maquinaria. Una empresa agrícola armada vale además por un nombre que el comprador reconoce y por cosas que sabe hacer y otros no. Eso solo se puede registrar y defender si hay una figura jurídica atrás.</w:t>
       </w:r>
     </w:p>
     <w:p>
@@ -306,7 +306,7 @@
           <w:sz w:val="24"/>
           <w:lang w:val="es-ES"/>
         </w:rPr>
-        <w:t>Natura es el caso más armado: montó una vicepresidencia de innovación, puso comités en cada unidad de negocio y armó equipos que cruzan áreas. BAC Credomatic va por otro lado y maneja las ideas con ferias internas, donde premia que se implementen y no que se propongan. Los dos textos le dan peso a la innovación abierta, que es aceptar ideas de afuera y no solo del área técnica propia. Brenes et al. (2014) la miden por la relación con universidades, y ahí las diferenciadas van bastante más lejos que el resto.</w:t>
+        <w:t>Natura es el caso más armado. Montó una vicepresidencia de innovación y comités en cada unidad de negocio, con equipos que cruzan áreas para discutir riesgos. BAC Credomatic va por otro lado y maneja las ideas con ferias internas, donde premia que se implementen y no que se propongan. Los dos textos le dan peso a la innovación abierta, que es aceptar ideas de afuera y no solo del área técnica propia. Brenes et al. (2014) la miden por la relación con universidades, y ahí las diferenciadas van bastante más lejos que el resto.</w:t>
       </w:r>
     </w:p>
     <w:p>
@@ -321,7 +321,7 @@
           <w:sz w:val="24"/>
           <w:lang w:val="es-ES"/>
         </w:rPr>
-        <w:t>El artículo tiene un problema de método. Escogieron empresas a las que ya les fue bien y después buscaron qué tenían en común, así que no aparece ninguna que hiciera lo mismo y fracasara. Tampoco discuten el orden de los factores: Natura pudo pagar una vicepresidencia entera porque ya era líder en Brasil, y capaz la estructura no la hizo rentable sino que ser rentable le permitió pagar la estructura. Queda algo más chico y más aplicable: para innovar seguido hace falta alguien a cargo, alguna forma de filtrar ideas y seguimiento de lo que se aprobó. En una empresa chica eso puede ser una persona y una reunión al mes.</w:t>
+        <w:t>El artículo tiene un problema de método. Escogieron empresas a las que ya les fue bien y después buscaron qué tenían en común, así que no aparece ninguna que hiciera lo mismo y fracasara. Tampoco discuten el orden de los factores: Natura pudo pagar una vicepresidencia entera porque ya era líder en Brasil, y capaz la estructura no la hizo rentable sino que ser rentable le permitió pagar la estructura. Queda algo más chico y más aplicable: para innovar seguido hace falta alguien a cargo y alguna forma de filtrar ideas, más el seguimiento de lo que se aprobó. En una empresa chica eso puede ser una persona y una reunión al mes.</w:t>
       </w:r>
     </w:p>
     <w:p>
@@ -336,7 +336,7 @@
           <w:sz w:val="24"/>
           <w:lang w:val="es-ES"/>
         </w:rPr>
-        <w:t>En Coopedota hay un dato que el artículo menciona de pasada. Lograron el primer café que neutraliza del todo sus emisiones de carbono trabajando en red con proveedores, universidades y consultores, y los productores aceptaron recibir menos dividendos para financiar la experimentación (Gibson et al., 2011). Innovar se pagó con el ingreso de los socios, apostando a algo que podía no funcionar. Una decisión así no puede salir solo de la gerencia: tiene que pasar por una asamblea y por socios que entiendan qué están arriesgando. Sin esa asamblea, el café carbono neutral de Coopedota habría sido una apuesta de la gerencia financiada con plata de los caficultores.</w:t>
+        <w:t>En Coopedota hay un dato que el artículo menciona de pasada. Lograron el primer café que neutraliza del todo sus emisiones de carbono trabajando en red con proveedores, universidades y consultores, y los productores aceptaron recibir menos dividendos para financiar la experimentación (Gibson et al., 2011). Innovar se pagó con el ingreso de los socios, apostando a algo que podía no funcionar. Por eso una decisión así tiene que pasar por una asamblea, con socios que entiendan qué están arriesgando. Sin ese paso, el café carbono neutral habría sido una apuesta de la gerencia financiada con plata de los caficultores.</w:t>
       </w:r>
     </w:p>
     <w:p>
@@ -397,7 +397,7 @@
           <w:sz w:val="24"/>
           <w:lang w:val="es-ES"/>
         </w:rPr>
-        <w:t>Las certificaciones y el control del canal atacan el mismo problema: el comprador no puede ver por dentro lo que compra. La certificación vuelve comprobable algo que el comprador no puede verificar solo, y controlar el canal hace que el producto llegue como se prometió. Britt se hizo cargo de su distribución cuando vio que el distribuidor contratado no entendía qué tenían de distinto sus productos, y Monteverde compró una distribuidora de refrigerados (Brenes et al., 2014). En promedio las diferenciadas están más integradas hacia adelante: 67% contra 39%. Pero de ahí no saco que todos deban integrarse. Los Grobo, que Gibson et al. (2011) elogian por ser liviana en activos, vende granos básicos, donde diferenciarse por atributos es difícil y lo que rinde es coordinar y bajar costos. Integrarse sirve cuando el valor se puede perder en el canal, no como regla general.</w:t>
+        <w:t>Las certificaciones y el control del canal atacan el mismo problema: el comprador no puede ver por dentro lo que compra. La certificación se lo resuelve poniendo a un tercero que garantice el atributo, y manejar la distribución hace que el producto llegue como se prometió. Britt se hizo cargo de su distribución cuando vio que el distribuidor contratado no entendía qué tenían de distinto sus productos, y Monteverde compró una distribuidora de refrigerados (Brenes et al., 2014). En promedio las diferenciadas están más integradas hacia adelante: 67% contra 39%. Pero de ahí no saco que todos deban integrarse. Los Grobo, que Gibson et al. (2011) elogian por ser liviana en activos, vende granos básicos, donde diferenciarse por atributos es difícil y lo que rinde es coordinar y bajar costos. Integrarse sirve cuando el valor se puede perder en el canal, no como regla general.</w:t>
       </w:r>
     </w:p>
     <w:p>
@@ -427,7 +427,7 @@
           <w:sz w:val="24"/>
           <w:lang w:val="es-ES"/>
         </w:rPr>
-        <w:t>De todas las herramientas de diferenciación que enumeran, el origen es la única que una empresa no fabrica sola, y ninguna de las lecturas lo discute. Depende de la fama del país, de la credibilidad sanitaria, de denominaciones que son de todos. En un agro donde la mayoría son productores chicos, eso empuja menos a copiar el organigrama de Natura y más a asociarse para cuidar algo compartido, que es volver a las formas societarias con que empezó la unidad.</w:t>
+        <w:t>De todas las herramientas de diferenciación que enumeran, el origen es la única que una empresa no fabrica sola, y ninguna de las lecturas lo discute. Depende de la fama del país, de la credibilidad sanitaria, de denominaciones que son de todos. En un agro donde la mayoría son productores chicos, eso empuja menos a copiar el organigrama de Natura y más a asociarse para cuidar algo compartido, que es volver al tema de las formas societarias.</w:t>
       </w:r>
     </w:p>
     <w:p>
@@ -488,7 +488,7 @@
           <w:sz w:val="24"/>
           <w:lang w:val="es-ES"/>
         </w:rPr>
-        <w:t>Ninguna de las cuatro cosas funciona sola. Una marca sin producto detrás se cae, una innovación que nadie aprueba ni financia no se hace, y una buena cosecha sin canal ni contrato se termina vendiendo al primer intermediario en las condiciones que él ponga. Tampoco creo que la respuesta sea formalizar todo al máximo: la estructura cuesta plata y una asamblea es lenta cuando hay que decidir en plena cosecha. Cada productor necesita la organización que corresponde al valor que quiere capturar. Quien vende commodity puede sobrevivir con poco. Quien quiere cobrar más que el vecino necesita marca, certificaciones, reglas de decisión y alguien que responda, y todo eso pide una figura jurídica que lo sostenga. Coopedota, Britt y Los Grobo muestran que las ideas están. Lo que falta son las estructuras que las sostengan cuando el fundador se cansa o el precio se cae.</w:t>
+        <w:t>Ninguna de las cuatro cosas funciona sola. Una marca sin producto detrás se cae. Una innovación que nadie aprueba ni financia queda en conversación. Y la mejor cosecha, si no tiene canal ni contrato, se termina vendiendo al primer intermediario en las condiciones que él ponga. Tampoco creo que la respuesta sea formalizar todo al máximo: la estructura cuesta plata y una asamblea es lenta cuando hay que decidir en plena cosecha. Cada productor necesita la organización que corresponde al valor que quiere capturar. Quien vende commodity puede sobrevivir con poco. Quien quiere cobrar más que el vecino necesita marca, certificaciones, reglas de decisión y alguien que responda, y todo eso pide una figura jurídica que lo sostenga. Coopedota, Britt y Los Grobo muestran que las ideas están. Lo que falta son las estructuras que las sostengan cuando el fundador se cansa o el precio se cae.</w:t>
       </w:r>
     </w:p>
     <w:p>

</xml_diff>